<commit_message>
Se ajusta elemento de contrato
</commit_message>
<xml_diff>
--- a/templates/CONTRATOS ARZEK/CORRESIDENCIAL/CONTRATO ARZEK CORRESIDENCIAL.docx
+++ b/templates/CONTRATOS ARZEK/CORRESIDENCIAL/CONTRATO ARZEK CORRESIDENCIAL.docx
@@ -106,7 +106,31 @@
           <w:szCs w:val="20"/>
           <w:shd w:fill="auto" w:val="clear"/>
         </w:rPr>
-        <w:t>${inm_co_acreditado_razon_social}</w:t>
+        <w:t>${</w:t>
+      </w:r>
+      <w:bookmarkStart w:id="0" w:name="__DdeLink__554_1429355168"/>
+      <w:r>
+        <w:rPr>
+          <w:rFonts w:cs="Arial" w:ascii="Arial" w:hAnsi="Arial"/>
+          <w:b/>
+          <w:bCs/>
+          <w:sz w:val="20"/>
+          <w:szCs w:val="20"/>
+          <w:shd w:fill="auto" w:val="clear"/>
+        </w:rPr>
+        <w:t>inm_co_acreditado_razon_social</w:t>
+      </w:r>
+      <w:bookmarkEnd w:id="0"/>
+      <w:r>
+        <w:rPr>
+          <w:rFonts w:cs="Arial" w:ascii="Arial" w:hAnsi="Arial"/>
+          <w:b/>
+          <w:bCs/>
+          <w:sz w:val="20"/>
+          <w:szCs w:val="20"/>
+          <w:shd w:fill="auto" w:val="clear"/>
+        </w:rPr>
+        <w:t>}</w:t>
       </w:r>
       <w:r>
         <w:rPr>
@@ -432,7 +456,41 @@
           <w:sz w:val="20"/>
           <w:szCs w:val="20"/>
         </w:rPr>
-        <w:t>Ser mexicanos, mayores de edad, de estado civil _____ con plena capacidad para contratar y obligarse, lo cual acreditan con copia de su identificación oficial vigente expedida por el Instituto Nacional Electoral, de la cual se adjunta copia al expediente.</w:t>
+        <w:t xml:space="preserve">Ser mexicanos, mayores de edad, de estado civil </w:t>
+      </w:r>
+      <w:r>
+        <w:rPr>
+          <w:rFonts w:cs="Arial" w:ascii="Arial" w:hAnsi="Arial"/>
+          <w:sz w:val="20"/>
+          <w:szCs w:val="20"/>
+        </w:rPr>
+        <w:t>${</w:t>
+      </w:r>
+      <w:bookmarkStart w:id="1" w:name="__DdeLink__556_1429355168"/>
+      <w:r>
+        <w:rPr>
+          <w:rFonts w:cs="Arial" w:ascii="Arial" w:hAnsi="Arial"/>
+          <w:sz w:val="20"/>
+          <w:szCs w:val="20"/>
+        </w:rPr>
+        <w:t>adm_estado_civil_descripcion</w:t>
+      </w:r>
+      <w:bookmarkEnd w:id="1"/>
+      <w:r>
+        <w:rPr>
+          <w:rFonts w:cs="Arial" w:ascii="Arial" w:hAnsi="Arial"/>
+          <w:sz w:val="20"/>
+          <w:szCs w:val="20"/>
+        </w:rPr>
+        <w:t>}</w:t>
+      </w:r>
+      <w:r>
+        <w:rPr>
+          <w:rFonts w:cs="Arial" w:ascii="Arial" w:hAnsi="Arial"/>
+          <w:sz w:val="20"/>
+          <w:szCs w:val="20"/>
+        </w:rPr>
+        <w:t xml:space="preserve"> con plena capacidad para contratar y obligarse, lo cual acreditan con copia de su identificación oficial vigente expedida por el Instituto Nacional Electoral, de la cual se adjunta copia al expediente.</w:t>
       </w:r>
     </w:p>
     <w:p>
@@ -862,7 +920,7 @@
           <w:szCs w:val="20"/>
         </w:rPr>
       </w:pPr>
-      <w:bookmarkStart w:id="0" w:name="_Hlk237794395"/>
+      <w:bookmarkStart w:id="2" w:name="_Hlk237794395"/>
       <w:r>
         <w:rPr>
           <w:rFonts w:cs="Arial" w:ascii="Arial" w:hAnsi="Arial"/>
@@ -924,7 +982,7 @@
         </w:rPr>
         <w:t>Realizar todas aquellas actividades necesarias o convenientes para el debido cumplimiento del objeto del presente contrato.</w:t>
       </w:r>
-      <w:bookmarkEnd w:id="0"/>
+      <w:bookmarkEnd w:id="2"/>
     </w:p>
     <w:p>
       <w:pPr>
@@ -2670,7 +2728,27 @@
           <w:szCs w:val="20"/>
           <w:shd w:fill="auto" w:val="clear"/>
         </w:rPr>
-        <w:t>${inm_ubicacion_domicilio_completo}</w:t>
+        <w:t>${</w:t>
+      </w:r>
+      <w:bookmarkStart w:id="3" w:name="__DdeLink__558_1429355168"/>
+      <w:r>
+        <w:rPr>
+          <w:rFonts w:cs="Arial" w:ascii="Arial" w:hAnsi="Arial"/>
+          <w:sz w:val="20"/>
+          <w:szCs w:val="20"/>
+          <w:shd w:fill="auto" w:val="clear"/>
+        </w:rPr>
+        <w:t>inm_ubicacion_domicilio_completo</w:t>
+      </w:r>
+      <w:bookmarkEnd w:id="3"/>
+      <w:r>
+        <w:rPr>
+          <w:rFonts w:cs="Arial" w:ascii="Arial" w:hAnsi="Arial"/>
+          <w:sz w:val="20"/>
+          <w:szCs w:val="20"/>
+          <w:shd w:fill="auto" w:val="clear"/>
+        </w:rPr>
+        <w:t>}</w:t>
       </w:r>
     </w:p>
     <w:p>

</xml_diff>

<commit_message>
Se ajusta elemento de anexo a
</commit_message>
<xml_diff>
--- a/templates/CONTRATOS ARZEK/CORRESIDENCIAL/CONTRATO ARZEK CORRESIDENCIAL.docx
+++ b/templates/CONTRATOS ARZEK/CORRESIDENCIAL/CONTRATO ARZEK CORRESIDENCIAL.docx
@@ -466,14 +466,33 @@
         </w:rPr>
         <w:t>${</w:t>
       </w:r>
+      <w:r>
+        <w:rPr>
+          <w:rFonts w:cs="Arial" w:ascii="Arial" w:hAnsi="Arial"/>
+          <w:sz w:val="20"/>
+          <w:szCs w:val="20"/>
+          <w:u w:val="single"/>
+        </w:rPr>
+        <w:t>i</w:t>
+      </w:r>
       <w:bookmarkStart w:id="1" w:name="__DdeLink__556_1429355168"/>
       <w:r>
         <w:rPr>
           <w:rFonts w:cs="Arial" w:ascii="Arial" w:hAnsi="Arial"/>
           <w:sz w:val="20"/>
           <w:szCs w:val="20"/>
-        </w:rPr>
-        <w:t>adm_estado_civil_descripcion</w:t>
+          <w:u w:val="single"/>
+        </w:rPr>
+        <w:t>nm</w:t>
+      </w:r>
+      <w:r>
+        <w:rPr>
+          <w:rFonts w:cs="Arial" w:ascii="Arial" w:hAnsi="Arial"/>
+          <w:sz w:val="20"/>
+          <w:szCs w:val="20"/>
+          <w:u w:val="single"/>
+        </w:rPr>
+        <w:t>_estado_civil_descripcion</w:t>
       </w:r>
       <w:bookmarkEnd w:id="1"/>
       <w:r>

</xml_diff>